<commit_message>
Update GRADE framework, note for Ji Wang and manuscript Methods to Ji Wang's reviewed rules
Co-Authored-By: Claude Sonnet 5.5 <noreply@anthropic.com>
Claude-Session: https://claude.ai/code/session_01FRD7etKqYN8v2bbXeeLMRW
</commit_message>
<xml_diff>
--- a/GRADE certainty framework (draft).docx
+++ b/GRADE certainty framework (draft).docx
@@ -31,7 +31,7 @@
           <w:sz w:val="26"/>
           <w:szCs w:val="26"/>
         </w:rPr>
-        <w:t xml:space="preserve">版本 v2026-10-25a（草稿）。适用：协议 v1.8 第 16 节（"Certainty will be described with GRADE principles; evidence drawn from case reports and series is expected to be of very low certainty"）。**这份框架在看到任何分析结果之前写好；各领域的判断规则先定，结果出来后只往里填。**</w:t>
+        <w:t xml:space="preserve">版本 v2026-10-25b（草稿）。适用：协议 v1.8 第 16 节（"Certainty will be described with GRADE principles; evidence drawn from case reports and series is expected to be of very low certainty"）。**规则在看到任何真实结局分析结果之前定好；结果出来后只往里填，不依结果改规则。**</w:t>
       </w:r>
     </w:p>
     <w:p>
@@ -50,7 +50,36 @@
         <w:rPr>
           <w:rFonts w:ascii="Calibri" w:cs="Calibri" w:eastAsia="Microsoft YaHei" w:hAnsi="Calibri"/>
         </w:rPr>
-        <w:t xml:space="preserve"> 框架里每条规则都是 Claude 的读法，须作者和 Ji Wang 确认后才生效。GRADE 原文没有在这里读到（只看了检索摘要），规则以原文为准。没有任何研究结果。</w:t>
+        <w:t xml:space="preserve"> 本版按王吉 2026-10-25 的统计复核记录（</w:t>
+      </w:r>
+      <w:r>
+        <w:rPr>
+          <w:rFonts w:ascii="Consolas" w:cs="Consolas" w:eastAsia="Microsoft YaHei" w:hAnsi="Consolas"/>
+          <w:sz w:val="19"/>
+          <w:szCs w:val="19"/>
+          <w:shd w:fill="EEEEEE" w:val="clear"/>
+        </w:rPr>
+        <w:t xml:space="preserve">analysis/jiwang_2026-10-25/统计决定与GRADE回复.md</w:t>
+      </w:r>
+      <w:r>
+        <w:rPr>
+          <w:rFonts w:ascii="Calibri" w:cs="Calibri" w:eastAsia="Microsoft YaHei" w:hAnsi="Calibri"/>
+        </w:rPr>
+        <w:t xml:space="preserve">）改写，取代 v2026-10-25a 中 Claude 暂定的机械门槛。作者报告：王吉已书面确认较窄的声明，并亲自看过、认可该记录。下面的数字（例如每翻倍比值比 0.80–1.25）是</w:t>
+      </w:r>
+      <w:r>
+        <w:rPr>
+          <w:rFonts w:ascii="Calibri" w:cs="Calibri" w:eastAsia="Microsoft YaHei" w:hAnsi="Calibri"/>
+          <w:b/>
+          <w:bCs/>
+        </w:rPr>
+        <w:t xml:space="preserve">本项目的事前约定，不是 GRADE 官方通用门槛，也不是经临床验证的最小重要差异</w:t>
+      </w:r>
+      <w:r>
+        <w:rPr>
+          <w:rFonts w:ascii="Calibri" w:cs="Calibri" w:eastAsia="Microsoft YaHei" w:hAnsi="Calibri"/>
+        </w:rPr>
+        <w:t xml:space="preserve">。GRADE 指南第 28 篇只读过作者摘要，全文入口返回 403，没有读到全文，不能说这些规则出自该文。没有任何研究结果，最终可信度一栏留空。</w:t>
       </w:r>
     </w:p>
     <w:p>
@@ -285,7 +314,7 @@
                 <w:sz w:val="19"/>
                 <w:szCs w:val="19"/>
               </w:rPr>
-              <w:t xml:space="preserve">主要结论，协议第 16 节主要分析</w:t>
+              <w:t xml:space="preserve">主要结论，做完整五领域评级。只评价关联，不据此宣称缩短等待时间可因果性提高保脾率</w:t>
             </w:r>
           </w:p>
         </w:tc>
@@ -384,7 +413,7 @@
                 <w:sz w:val="19"/>
                 <w:szCs w:val="19"/>
               </w:rPr>
-              <w:t xml:space="preserve">次要，单一比例</w:t>
+              <w:t xml:space="preserve">次要，单一比例，另列描述性证据局限，不套用预后因素关联的起点直接评级</w:t>
             </w:r>
           </w:p>
         </w:tc>
@@ -483,7 +512,7 @@
                 <w:sz w:val="19"/>
                 <w:szCs w:val="19"/>
               </w:rPr>
-              <w:t xml:space="preserve">次要，各自较弱，只作简要描述</w:t>
+              <w:t xml:space="preserve">逐项简述证据局限；若成为摘要或结论中的关键主张，须补做独立完整评级，不借用主要结论的等级</w:t>
             </w:r>
           </w:p>
         </w:tc>
@@ -493,17 +522,6 @@
       <w:pPr>
         <w:spacing w:after="120"/>
       </w:pPr>
-    </w:p>
-    <w:p>
-      <w:pPr>
-        <w:spacing w:after="120"/>
-      </w:pPr>
-      <w:r>
-        <w:rPr>
-          <w:rFonts w:ascii="Calibri" w:cs="Calibri" w:eastAsia="Microsoft YaHei" w:hAnsi="Calibri"/>
-        </w:rPr>
-        <w:t xml:space="preserve">协议没有要求逐个结论做完整证据概要表；这里建议只对第 1 条做完整评级，第 2、3 条用一句话说明。这是 Claude 的读法。</w:t>
-      </w:r>
     </w:p>
     <w:p>
       <w:pPr>
@@ -515,7 +533,7 @@
         <w:rPr>
           <w:rFonts w:ascii="Calibri" w:cs="Calibri" w:eastAsia="Microsoft YaHei" w:hAnsi="Calibri"/>
         </w:rPr>
-        <w:t xml:space="preserve">2. 起点怎么定</w:t>
+        <w:t xml:space="preserve">2. 起点</w:t>
       </w:r>
     </w:p>
     <w:p>
@@ -531,7 +549,7 @@
         <w:rPr>
           <w:rFonts w:ascii="Calibri" w:cs="Calibri" w:eastAsia="Microsoft YaHei" w:hAnsi="Calibri"/>
         </w:rPr>
-        <w:t xml:space="preserve">本研究的主要问题是"暴露（持续时间）和结局有没有关联"，性质更接近预后因素研究，不是干预效果。据检索到的 GRADE 指南第 28 篇（Foroutan 等，J Clin Epidemiol 2020）的摘要，预后问题中观察性研究的证据</w:t>
+        <w:t xml:space="preserve">主要问题是持续时间与结局的关联，按预后因素研究处理。据 GRADE 指南第 28 篇的作者摘要，预后观察性证据</w:t>
       </w:r>
       <w:r>
         <w:rPr>
@@ -539,13 +557,13 @@
           <w:b/>
           <w:bCs/>
         </w:rPr>
-        <w:t xml:space="preserve">起点为高</w:t>
-      </w:r>
-      <w:r>
-        <w:rPr>
-          <w:rFonts w:ascii="Calibri" w:cs="Calibri" w:eastAsia="Microsoft YaHei" w:hAnsi="Calibri"/>
-        </w:rPr>
-        <w:t xml:space="preserve">，再按五个降级领域降级（摘要只是转述，须读原文核对）。</w:t>
+        <w:t xml:space="preserve">从高起步</w:t>
+      </w:r>
+      <w:r>
+        <w:rPr>
+          <w:rFonts w:ascii="Calibri" w:cs="Calibri" w:eastAsia="Microsoft YaHei" w:hAnsi="Calibri"/>
+        </w:rPr>
+        <w:t xml:space="preserve">。本项目采用高起点。</w:t>
       </w:r>
     </w:p>
     <w:p>
@@ -561,21 +579,7 @@
         <w:rPr>
           <w:rFonts w:ascii="Calibri" w:cs="Calibri" w:eastAsia="Microsoft YaHei" w:hAnsi="Calibri"/>
         </w:rPr>
-        <w:t xml:space="preserve">协议写的是预期"很低"。两条路径都可以走到很低：起点高、在偏倚风险、不精确等领域多次降级；或者起点低（按干预证据的惯例）。</w:t>
-      </w:r>
-      <w:r>
-        <w:rPr>
-          <w:rFonts w:ascii="Calibri" w:cs="Calibri" w:eastAsia="Microsoft YaHei" w:hAnsi="Calibri"/>
-          <w:b/>
-          <w:bCs/>
-        </w:rPr>
-        <w:t xml:space="preserve">起点选哪个，由作者和 Ji Wang 在看结果之前决定</w:t>
-      </w:r>
-      <w:r>
-        <w:rPr>
-          <w:rFonts w:ascii="Calibri" w:cs="Calibri" w:eastAsia="Microsoft YaHei" w:hAnsi="Calibri"/>
-        </w:rPr>
-        <w:t xml:space="preserve">；本框架两种都给出，最终判断相同时不影响结论。</w:t>
+        <w:t xml:space="preserve">高只是起点，不是最终评级；病例报告的个体数据与前瞻性预后队列有明显区别，这一差别在间接性、选择偏倚和混杂中评价，不在起点处预先扣级。</w:t>
       </w:r>
     </w:p>
     <w:p>
@@ -591,7 +595,21 @@
         <w:rPr>
           <w:rFonts w:ascii="Calibri" w:cs="Calibri" w:eastAsia="Microsoft YaHei" w:hAnsi="Calibri"/>
         </w:rPr>
-        <w:t xml:space="preserve">建议：按预后因素研究的做法，起点为高，并写明理由。【待确认】</w:t>
+        <w:t xml:space="preserve">总规则：每个领域最多降 2 级；同一问题原则上只在最直接的领域扣级，并记录交叉影响，不重复惩罚；总等级最低为极低。评级由团队记录依据、患者权重和分歧，</w:t>
+      </w:r>
+      <w:r>
+        <w:rPr>
+          <w:rFonts w:ascii="Calibri" w:cs="Calibri" w:eastAsia="Microsoft YaHei" w:hAnsi="Calibri"/>
+          <w:b/>
+          <w:bCs/>
+        </w:rPr>
+        <w:t xml:space="preserve">不由脚本自动算分</w:t>
+      </w:r>
+      <w:r>
+        <w:rPr>
+          <w:rFonts w:ascii="Calibri" w:cs="Calibri" w:eastAsia="Microsoft YaHei" w:hAnsi="Calibri"/>
+        </w:rPr>
+        <w:t xml:space="preserve">。</w:t>
       </w:r>
     </w:p>
     <w:p>
@@ -604,7 +622,7 @@
         <w:rPr>
           <w:rFonts w:ascii="Calibri" w:cs="Calibri" w:eastAsia="Microsoft YaHei" w:hAnsi="Calibri"/>
         </w:rPr>
-        <w:t xml:space="preserve">3. 五个降级领域：规则和数据来源</w:t>
+        <w:t xml:space="preserve">3. 五个降级领域</w:t>
       </w:r>
     </w:p>
     <w:tbl>
@@ -620,9 +638,9 @@
         </w:tblBorders>
       </w:tblPr>
       <w:tblGrid>
-        <w:gridCol w:w="1444"/>
-        <w:gridCol w:w="3971"/>
-        <w:gridCol w:w="3611"/>
+        <w:gridCol w:w="1264"/>
+        <w:gridCol w:w="4694"/>
+        <w:gridCol w:w="3068"/>
       </w:tblGrid>
       <w:tr>
         <w:trPr>
@@ -631,7 +649,7 @@
         </w:trPr>
         <w:tc>
           <w:tcPr>
-            <w:tcW w:type="dxa" w:w="1444"/>
+            <w:tcW w:type="dxa" w:w="1264"/>
             <w:tcBorders>
               <w:top w:val="single" w:color="BBBBBB" w:sz="4"/>
               <w:left w:val="single" w:color="BBBBBB" w:sz="4"/>
@@ -665,7 +683,7 @@
         </w:tc>
         <w:tc>
           <w:tcPr>
-            <w:tcW w:type="dxa" w:w="3971"/>
+            <w:tcW w:type="dxa" w:w="4694"/>
             <w:tcBorders>
               <w:top w:val="single" w:color="BBBBBB" w:sz="4"/>
               <w:left w:val="single" w:color="BBBBBB" w:sz="4"/>
@@ -693,13 +711,13 @@
                 <w:sz w:val="19"/>
                 <w:szCs w:val="19"/>
               </w:rPr>
-              <w:t xml:space="preserve">先定的判断规则</w:t>
-            </w:r>
-          </w:p>
-        </w:tc>
-        <w:tc>
-          <w:tcPr>
-            <w:tcW w:type="dxa" w:w="3611"/>
+              <w:t xml:space="preserve">事前规则</w:t>
+            </w:r>
+          </w:p>
+        </w:tc>
+        <w:tc>
+          <w:tcPr>
+            <w:tcW w:type="dxa" w:w="3068"/>
             <w:tcBorders>
               <w:top w:val="single" w:color="BBBBBB" w:sz="4"/>
               <w:left w:val="single" w:color="BBBBBB" w:sz="4"/>
@@ -739,7 +757,7 @@
         </w:trPr>
         <w:tc>
           <w:tcPr>
-            <w:tcW w:type="dxa" w:w="1444"/>
+            <w:tcW w:type="dxa" w:w="1264"/>
             <w:tcBorders>
               <w:top w:val="single" w:color="BBBBBB" w:sz="4"/>
               <w:left w:val="single" w:color="BBBBBB" w:sz="4"/>
@@ -770,38 +788,56 @@
         </w:tc>
         <w:tc>
           <w:tcPr>
-            <w:tcW w:type="dxa" w:w="3971"/>
-            <w:tcBorders>
-              <w:top w:val="single" w:color="BBBBBB" w:sz="4"/>
-              <w:left w:val="single" w:color="BBBBBB" w:sz="4"/>
-              <w:bottom w:val="single" w:color="BBBBBB" w:sz="4"/>
-              <w:right w:val="single" w:color="BBBBBB" w:sz="4"/>
-            </w:tcBorders>
-            <w:tcMar>
-              <w:top w:type="dxa" w:w="55"/>
-              <w:left w:type="dxa" w:w="95"/>
-              <w:bottom w:type="dxa" w:w="55"/>
-              <w:right w:type="dxa" w:w="95"/>
-            </w:tcMar>
-            <w:vAlign w:val="top"/>
-          </w:tcPr>
-          <w:p>
-            <w:pPr>
-              <w:spacing w:after="0"/>
-            </w:pPr>
-            <w:r>
-              <w:rPr>
-                <w:rFonts w:ascii="Calibri" w:cs="Calibri" w:eastAsia="Microsoft YaHei" w:hAnsi="Calibri"/>
-                <w:sz w:val="19"/>
-                <w:szCs w:val="19"/>
-              </w:rPr>
-              <w:t xml:space="preserve">按偏倚风险表的 adequate：评为足够的报告占纳入主要分析患者的比例。多数患者来自不足够的报告 → 降 1 级；几乎所有患者都来自不足够的报告，或暴露、结局条目普遍不满足 → 降 2 级。另考虑：只纳入做了手术的儿童（没做手术的不在内）、报告选择性发表保脾病例</w:t>
-            </w:r>
-          </w:p>
-        </w:tc>
-        <w:tc>
-          <w:tcPr>
-            <w:tcW w:type="dxa" w:w="3611"/>
+            <w:tcW w:type="dxa" w:w="4694"/>
+            <w:tcBorders>
+              <w:top w:val="single" w:color="BBBBBB" w:sz="4"/>
+              <w:left w:val="single" w:color="BBBBBB" w:sz="4"/>
+              <w:bottom w:val="single" w:color="BBBBBB" w:sz="4"/>
+              <w:right w:val="single" w:color="BBBBBB" w:sz="4"/>
+            </w:tcBorders>
+            <w:tcMar>
+              <w:top w:type="dxa" w:w="55"/>
+              <w:left w:type="dxa" w:w="95"/>
+              <w:bottom w:type="dxa" w:w="55"/>
+              <w:right w:type="dxa" w:w="95"/>
+            </w:tcMar>
+            <w:vAlign w:val="top"/>
+          </w:tcPr>
+          <w:p>
+            <w:pPr>
+              <w:spacing w:after="0"/>
+            </w:pPr>
+            <w:r>
+              <w:rPr>
+                <w:rFonts w:ascii="Calibri" w:cs="Calibri" w:eastAsia="Microsoft YaHei" w:hAnsi="Calibri"/>
+                <w:sz w:val="19"/>
+                <w:szCs w:val="19"/>
+              </w:rPr>
+              <w:t xml:space="preserve">偏倚风险表 adequate 的患者比例</w:t>
+            </w:r>
+            <w:r>
+              <w:rPr>
+                <w:rFonts w:ascii="Calibri" w:cs="Calibri" w:eastAsia="Microsoft YaHei" w:hAnsi="Calibri"/>
+                <w:b/>
+                <w:bCs/>
+                <w:sz w:val="19"/>
+                <w:szCs w:val="19"/>
+              </w:rPr>
+              <w:t xml:space="preserve">只作描述，不决定等级</w:t>
+            </w:r>
+            <w:r>
+              <w:rPr>
+                <w:rFonts w:ascii="Calibri" w:cs="Calibri" w:eastAsia="Microsoft YaHei" w:hAnsi="Calibri"/>
+                <w:sz w:val="19"/>
+                <w:szCs w:val="19"/>
+              </w:rPr>
+              <w:t xml:space="preserve">。判断选择入组、时间与结局测量、缺失、重复和混杂是否可能实质改变关联：存在实质问题降 1 级；问题普遍、足以使关联方向或大小不可信降 2 级。病例是否进入文献与其结局相关、仅调整年龄和时期无法控制病情严重度，须单列。不得调整明确位于因果通路上的因素来"消除"偏倚</w:t>
+            </w:r>
+          </w:p>
+        </w:tc>
+        <w:tc>
+          <w:tcPr>
+            <w:tcW w:type="dxa" w:w="3068"/>
             <w:tcBorders>
               <w:top w:val="single" w:color="BBBBBB" w:sz="4"/>
               <w:left w:val="single" w:color="BBBBBB" w:sz="4"/>
@@ -835,7 +871,7 @@
                 <w:sz w:val="19"/>
                 <w:szCs w:val="19"/>
               </w:rPr>
-              <w:t xml:space="preserve">、偏倚风险的分歧清单、敏感性分析 5</w:t>
+              <w:t xml:space="preserve">、偏倚风险分歧清单、敏感性分析 5</w:t>
             </w:r>
           </w:p>
         </w:tc>
@@ -847,7 +883,7 @@
         </w:trPr>
         <w:tc>
           <w:tcPr>
-            <w:tcW w:type="dxa" w:w="1444"/>
+            <w:tcW w:type="dxa" w:w="1264"/>
             <w:tcBorders>
               <w:top w:val="single" w:color="BBBBBB" w:sz="4"/>
               <w:left w:val="single" w:color="BBBBBB" w:sz="4"/>
@@ -878,63 +914,99 @@
         </w:tc>
         <w:tc>
           <w:tcPr>
-            <w:tcW w:type="dxa" w:w="3971"/>
-            <w:tcBorders>
-              <w:top w:val="single" w:color="BBBBBB" w:sz="4"/>
-              <w:left w:val="single" w:color="BBBBBB" w:sz="4"/>
-              <w:bottom w:val="single" w:color="BBBBBB" w:sz="4"/>
-              <w:right w:val="single" w:color="BBBBBB" w:sz="4"/>
-            </w:tcBorders>
-            <w:tcMar>
-              <w:top w:type="dxa" w:w="55"/>
-              <w:left w:type="dxa" w:w="95"/>
-              <w:bottom w:type="dxa" w:w="55"/>
-              <w:right w:type="dxa" w:w="95"/>
-            </w:tcMar>
-            <w:vAlign w:val="top"/>
-          </w:tcPr>
-          <w:p>
-            <w:pPr>
-              <w:spacing w:after="0"/>
-            </w:pPr>
-            <w:r>
-              <w:rPr>
-                <w:rFonts w:ascii="Calibri" w:cs="Calibri" w:eastAsia="Microsoft YaHei" w:hAnsi="Calibri"/>
-                <w:sz w:val="19"/>
-                <w:szCs w:val="19"/>
-              </w:rPr>
-              <w:t xml:space="preserve">各报告的效应方向是否一致。主要用混合效应模型的随机截距方差（敏感性分析 8）和去掉单个大系列后的估计（敏感性分析 1、6）；估计的方向或大小明显改变 → 降 1 级</w:t>
-            </w:r>
-          </w:p>
-        </w:tc>
-        <w:tc>
-          <w:tcPr>
-            <w:tcW w:type="dxa" w:w="3611"/>
-            <w:tcBorders>
-              <w:top w:val="single" w:color="BBBBBB" w:sz="4"/>
-              <w:left w:val="single" w:color="BBBBBB" w:sz="4"/>
-              <w:bottom w:val="single" w:color="BBBBBB" w:sz="4"/>
-              <w:right w:val="single" w:color="BBBBBB" w:sz="4"/>
-            </w:tcBorders>
-            <w:tcMar>
-              <w:top w:type="dxa" w:w="55"/>
-              <w:left w:type="dxa" w:w="95"/>
-              <w:bottom w:type="dxa" w:w="55"/>
-              <w:right w:type="dxa" w:w="95"/>
-            </w:tcMar>
-            <w:vAlign w:val="top"/>
-          </w:tcPr>
-          <w:p>
-            <w:pPr>
-              <w:spacing w:after="0"/>
-            </w:pPr>
-            <w:r>
-              <w:rPr>
-                <w:rFonts w:ascii="Calibri" w:cs="Calibri" w:eastAsia="Microsoft YaHei" w:hAnsi="Calibri"/>
-                <w:sz w:val="19"/>
-                <w:szCs w:val="19"/>
-              </w:rPr>
-              <w:t xml:space="preserve">主要分析、敏感性分析 1、5、6、8、附加分析 (a)–(d)</w:t>
+            <w:tcW w:type="dxa" w:w="4694"/>
+            <w:tcBorders>
+              <w:top w:val="single" w:color="BBBBBB" w:sz="4"/>
+              <w:left w:val="single" w:color="BBBBBB" w:sz="4"/>
+              <w:bottom w:val="single" w:color="BBBBBB" w:sz="4"/>
+              <w:right w:val="single" w:color="BBBBBB" w:sz="4"/>
+            </w:tcBorders>
+            <w:tcMar>
+              <w:top w:type="dxa" w:w="55"/>
+              <w:left w:type="dxa" w:w="95"/>
+              <w:bottom w:type="dxa" w:w="55"/>
+              <w:right w:type="dxa" w:w="95"/>
+            </w:tcMar>
+            <w:vAlign w:val="top"/>
+          </w:tcPr>
+          <w:p>
+            <w:pPr>
+              <w:spacing w:after="0"/>
+            </w:pPr>
+            <w:r>
+              <w:rPr>
+                <w:rFonts w:ascii="Calibri" w:cs="Calibri" w:eastAsia="Microsoft YaHei" w:hAnsi="Calibri"/>
+                <w:sz w:val="19"/>
+                <w:szCs w:val="19"/>
+              </w:rPr>
+              <w:t xml:space="preserve">随机截距方差描述基线风险差异，</w:t>
+            </w:r>
+            <w:r>
+              <w:rPr>
+                <w:rFonts w:ascii="Calibri" w:cs="Calibri" w:eastAsia="Microsoft YaHei" w:hAnsi="Calibri"/>
+                <w:b/>
+                <w:bCs/>
+                <w:sz w:val="19"/>
+                <w:szCs w:val="19"/>
+              </w:rPr>
+              <w:t xml:space="preserve">不是持续时间斜率的异质性</w:t>
+            </w:r>
+            <w:r>
+              <w:rPr>
+                <w:rFonts w:ascii="Calibri" w:cs="Calibri" w:eastAsia="Microsoft YaHei" w:hAnsi="Calibri"/>
+                <w:sz w:val="19"/>
+                <w:szCs w:val="19"/>
+              </w:rPr>
+              <w:t xml:space="preserve">，不据此判断。按预定亚组及逐一剔除大系列，观察方向与大小，兼顾区间重叠和样本不稳定性。无法由偏倚或精度解释的实质差异降 1 级；强烈相反且无法解释降 2 级。单例报告不能各自估计效应，异质性无法可靠评价时如实说明，不把"未发现差异"当作一致的证据。敏感性分析 1 和 6 分别是剔除本院和中文报告，</w:t>
+            </w:r>
+            <w:r>
+              <w:rPr>
+                <w:rFonts w:ascii="Calibri" w:cs="Calibri" w:eastAsia="Microsoft YaHei" w:hAnsi="Calibri"/>
+                <w:b/>
+                <w:bCs/>
+                <w:sz w:val="19"/>
+                <w:szCs w:val="19"/>
+              </w:rPr>
+              <w:t xml:space="preserve">不等于逐一剔除大系列</w:t>
+            </w:r>
+            <w:r>
+              <w:rPr>
+                <w:rFonts w:ascii="Calibri" w:cs="Calibri" w:eastAsia="Microsoft YaHei" w:hAnsi="Calibri"/>
+                <w:sz w:val="19"/>
+                <w:szCs w:val="19"/>
+              </w:rPr>
+              <w:t xml:space="preserve">，需另做</w:t>
+            </w:r>
+          </w:p>
+        </w:tc>
+        <w:tc>
+          <w:tcPr>
+            <w:tcW w:type="dxa" w:w="3068"/>
+            <w:tcBorders>
+              <w:top w:val="single" w:color="BBBBBB" w:sz="4"/>
+              <w:left w:val="single" w:color="BBBBBB" w:sz="4"/>
+              <w:bottom w:val="single" w:color="BBBBBB" w:sz="4"/>
+              <w:right w:val="single" w:color="BBBBBB" w:sz="4"/>
+            </w:tcBorders>
+            <w:tcMar>
+              <w:top w:type="dxa" w:w="55"/>
+              <w:left w:type="dxa" w:w="95"/>
+              <w:bottom w:type="dxa" w:w="55"/>
+              <w:right w:type="dxa" w:w="95"/>
+            </w:tcMar>
+            <w:vAlign w:val="top"/>
+          </w:tcPr>
+          <w:p>
+            <w:pPr>
+              <w:spacing w:after="0"/>
+            </w:pPr>
+            <w:r>
+              <w:rPr>
+                <w:rFonts w:ascii="Calibri" w:cs="Calibri" w:eastAsia="Microsoft YaHei" w:hAnsi="Calibri"/>
+                <w:sz w:val="19"/>
+                <w:szCs w:val="19"/>
+              </w:rPr>
+              <w:t xml:space="preserve">主要分析、预定亚组、敏感性分析、附加分析</w:t>
             </w:r>
           </w:p>
         </w:tc>
@@ -946,7 +1018,7 @@
         </w:trPr>
         <w:tc>
           <w:tcPr>
-            <w:tcW w:type="dxa" w:w="1444"/>
+            <w:tcW w:type="dxa" w:w="1264"/>
             <w:tcBorders>
               <w:top w:val="single" w:color="BBBBBB" w:sz="4"/>
               <w:left w:val="single" w:color="BBBBBB" w:sz="4"/>
@@ -977,63 +1049,89 @@
         </w:tc>
         <w:tc>
           <w:tcPr>
-            <w:tcW w:type="dxa" w:w="3971"/>
-            <w:tcBorders>
-              <w:top w:val="single" w:color="BBBBBB" w:sz="4"/>
-              <w:left w:val="single" w:color="BBBBBB" w:sz="4"/>
-              <w:bottom w:val="single" w:color="BBBBBB" w:sz="4"/>
-              <w:right w:val="single" w:color="BBBBBB" w:sz="4"/>
-            </w:tcBorders>
-            <w:tcMar>
-              <w:top w:type="dxa" w:w="55"/>
-              <w:left w:type="dxa" w:w="95"/>
-              <w:bottom w:type="dxa" w:w="55"/>
-              <w:right w:type="dxa" w:w="95"/>
-            </w:tcMar>
-            <w:vAlign w:val="top"/>
-          </w:tcPr>
-          <w:p>
-            <w:pPr>
-              <w:spacing w:after="0"/>
-            </w:pPr>
-            <w:r>
-              <w:rPr>
-                <w:rFonts w:ascii="Calibri" w:cs="Calibri" w:eastAsia="Microsoft YaHei" w:hAnsi="Calibri"/>
-                <w:sz w:val="19"/>
-                <w:szCs w:val="19"/>
-              </w:rPr>
-              <w:t xml:space="preserve">人群是 18 岁以下游走脾，暴露是指数发作持续时间，结局是手术时脾脏活力，与问题直接对应。持续时间多为"至就诊或入院"的下限、脾脏活力常靠影像推断时，考虑降 1 级</w:t>
-            </w:r>
-          </w:p>
-        </w:tc>
-        <w:tc>
-          <w:tcPr>
-            <w:tcW w:type="dxa" w:w="3611"/>
-            <w:tcBorders>
-              <w:top w:val="single" w:color="BBBBBB" w:sz="4"/>
-              <w:left w:val="single" w:color="BBBBBB" w:sz="4"/>
-              <w:bottom w:val="single" w:color="BBBBBB" w:sz="4"/>
-              <w:right w:val="single" w:color="BBBBBB" w:sz="4"/>
-            </w:tcBorders>
-            <w:tcMar>
-              <w:top w:type="dxa" w:w="55"/>
-              <w:left w:type="dxa" w:w="95"/>
-              <w:bottom w:type="dxa" w:w="55"/>
-              <w:right w:type="dxa" w:w="95"/>
-            </w:tcMar>
-            <w:vAlign w:val="top"/>
-          </w:tcPr>
-          <w:p>
-            <w:pPr>
-              <w:spacing w:after="0"/>
-            </w:pPr>
-            <w:r>
-              <w:rPr>
-                <w:rFonts w:ascii="Calibri" w:cs="Calibri" w:eastAsia="Microsoft YaHei" w:hAnsi="Calibri"/>
-                <w:sz w:val="19"/>
-                <w:szCs w:val="19"/>
-              </w:rPr>
-              <w:t xml:space="preserve">附加分析 (c) 去掉下限时长；提取表里的 viab_basis、idx_dur_lower_bound</w:t>
+            <w:tcW w:type="dxa" w:w="4694"/>
+            <w:tcBorders>
+              <w:top w:val="single" w:color="BBBBBB" w:sz="4"/>
+              <w:left w:val="single" w:color="BBBBBB" w:sz="4"/>
+              <w:bottom w:val="single" w:color="BBBBBB" w:sz="4"/>
+              <w:right w:val="single" w:color="BBBBBB" w:sz="4"/>
+            </w:tcBorders>
+            <w:tcMar>
+              <w:top w:type="dxa" w:w="55"/>
+              <w:left w:type="dxa" w:w="95"/>
+              <w:bottom w:type="dxa" w:w="55"/>
+              <w:right w:type="dxa" w:w="95"/>
+            </w:tcMar>
+            <w:vAlign w:val="top"/>
+          </w:tcPr>
+          <w:p>
+            <w:pPr>
+              <w:spacing w:after="0"/>
+            </w:pPr>
+            <w:r>
+              <w:rPr>
+                <w:rFonts w:ascii="Calibri" w:cs="Calibri" w:eastAsia="Microsoft YaHei" w:hAnsi="Calibri"/>
+                <w:sz w:val="19"/>
+                <w:szCs w:val="19"/>
+              </w:rPr>
+              <w:t xml:space="preserve">目标是术中或组织学活力。影像推断违反提取规则，应先纠正或设为缺失，不能用降级来掩盖违规。大量患者只有到入院的时长而无到手术的时长，或目标人群与实际入组有实质差别，降 1 级；极严重不匹配降 2 级。若结论严格限定于接受手术者，不因这一定义本身重复扣级</w:t>
+            </w:r>
+          </w:p>
+        </w:tc>
+        <w:tc>
+          <w:tcPr>
+            <w:tcW w:type="dxa" w:w="3068"/>
+            <w:tcBorders>
+              <w:top w:val="single" w:color="BBBBBB" w:sz="4"/>
+              <w:left w:val="single" w:color="BBBBBB" w:sz="4"/>
+              <w:bottom w:val="single" w:color="BBBBBB" w:sz="4"/>
+              <w:right w:val="single" w:color="BBBBBB" w:sz="4"/>
+            </w:tcBorders>
+            <w:tcMar>
+              <w:top w:type="dxa" w:w="55"/>
+              <w:left w:type="dxa" w:w="95"/>
+              <w:bottom w:type="dxa" w:w="55"/>
+              <w:right w:type="dxa" w:w="95"/>
+            </w:tcMar>
+            <w:vAlign w:val="top"/>
+          </w:tcPr>
+          <w:p>
+            <w:pPr>
+              <w:spacing w:after="0"/>
+            </w:pPr>
+            <w:r>
+              <w:rPr>
+                <w:rFonts w:ascii="Calibri" w:cs="Calibri" w:eastAsia="Microsoft YaHei" w:hAnsi="Calibri"/>
+                <w:sz w:val="19"/>
+                <w:szCs w:val="19"/>
+              </w:rPr>
+              <w:t xml:space="preserve">附加分析（去掉下限时长）、</w:t>
+            </w:r>
+            <w:r>
+              <w:rPr>
+                <w:rFonts w:ascii="Consolas" w:cs="Consolas" w:eastAsia="Microsoft YaHei" w:hAnsi="Consolas"/>
+                <w:sz w:val="19"/>
+                <w:szCs w:val="19"/>
+                <w:shd w:fill="EEEEEE" w:val="clear"/>
+              </w:rPr>
+              <w:t xml:space="preserve">viab_basis</w:t>
+            </w:r>
+            <w:r>
+              <w:rPr>
+                <w:rFonts w:ascii="Calibri" w:cs="Calibri" w:eastAsia="Microsoft YaHei" w:hAnsi="Calibri"/>
+                <w:sz w:val="19"/>
+                <w:szCs w:val="19"/>
+              </w:rPr>
+              <w:t xml:space="preserve">、</w:t>
+            </w:r>
+            <w:r>
+              <w:rPr>
+                <w:rFonts w:ascii="Consolas" w:cs="Consolas" w:eastAsia="Microsoft YaHei" w:hAnsi="Consolas"/>
+                <w:sz w:val="19"/>
+                <w:szCs w:val="19"/>
+                <w:shd w:fill="EEEEEE" w:val="clear"/>
+              </w:rPr>
+              <w:t xml:space="preserve">idx_dur_lower_bound</w:t>
             </w:r>
           </w:p>
         </w:tc>
@@ -1045,7 +1143,7 @@
         </w:trPr>
         <w:tc>
           <w:tcPr>
-            <w:tcW w:type="dxa" w:w="1444"/>
+            <w:tcW w:type="dxa" w:w="1264"/>
             <w:tcBorders>
               <w:top w:val="single" w:color="BBBBBB" w:sz="4"/>
               <w:left w:val="single" w:color="BBBBBB" w:sz="4"/>
@@ -1076,63 +1174,91 @@
         </w:tc>
         <w:tc>
           <w:tcPr>
-            <w:tcW w:type="dxa" w:w="3971"/>
-            <w:tcBorders>
-              <w:top w:val="single" w:color="BBBBBB" w:sz="4"/>
-              <w:left w:val="single" w:color="BBBBBB" w:sz="4"/>
-              <w:bottom w:val="single" w:color="BBBBBB" w:sz="4"/>
-              <w:right w:val="single" w:color="BBBBBB" w:sz="4"/>
-            </w:tcBorders>
-            <w:tcMar>
-              <w:top w:type="dxa" w:w="55"/>
-              <w:left w:type="dxa" w:w="95"/>
-              <w:bottom w:type="dxa" w:w="55"/>
-              <w:right w:type="dxa" w:w="95"/>
-            </w:tcMar>
-            <w:vAlign w:val="top"/>
-          </w:tcPr>
-          <w:p>
-            <w:pPr>
-              <w:spacing w:after="0"/>
-            </w:pPr>
-            <w:r>
-              <w:rPr>
-                <w:rFonts w:ascii="Calibri" w:cs="Calibri" w:eastAsia="Microsoft YaHei" w:hAnsi="Calibri"/>
-                <w:sz w:val="19"/>
-                <w:szCs w:val="19"/>
-              </w:rPr>
-              <w:t xml:space="preserve">看置信区间：包含无效应（比值比 = 1），或下限与上限差别大到会改变结论 → 降 1 级；事件数小于每个自由度 10 个（协议第 16 节样条条件）或区间既包含无效应又包含相当大的获益/伤害 → 降 2 级</w:t>
-            </w:r>
-          </w:p>
-        </w:tc>
-        <w:tc>
-          <w:tcPr>
-            <w:tcW w:type="dxa" w:w="3611"/>
-            <w:tcBorders>
-              <w:top w:val="single" w:color="BBBBBB" w:sz="4"/>
-              <w:left w:val="single" w:color="BBBBBB" w:sz="4"/>
-              <w:bottom w:val="single" w:color="BBBBBB" w:sz="4"/>
-              <w:right w:val="single" w:color="BBBBBB" w:sz="4"/>
-            </w:tcBorders>
-            <w:tcMar>
-              <w:top w:type="dxa" w:w="55"/>
-              <w:left w:type="dxa" w:w="95"/>
-              <w:bottom w:type="dxa" w:w="55"/>
-              <w:right w:type="dxa" w:w="95"/>
-            </w:tcMar>
-            <w:vAlign w:val="top"/>
-          </w:tcPr>
-          <w:p>
-            <w:pPr>
-              <w:spacing w:after="0"/>
-            </w:pPr>
-            <w:r>
-              <w:rPr>
-                <w:rFonts w:ascii="Calibri" w:cs="Calibri" w:eastAsia="Microsoft YaHei" w:hAnsi="Calibri"/>
-                <w:sz w:val="19"/>
-                <w:szCs w:val="19"/>
-              </w:rPr>
-              <w:t xml:space="preserve">主要分析的比值比和 95% 置信区间、事件数</w:t>
+            <w:tcW w:type="dxa" w:w="4694"/>
+            <w:tcBorders>
+              <w:top w:val="single" w:color="BBBBBB" w:sz="4"/>
+              <w:left w:val="single" w:color="BBBBBB" w:sz="4"/>
+              <w:bottom w:val="single" w:color="BBBBBB" w:sz="4"/>
+              <w:right w:val="single" w:color="BBBBBB" w:sz="4"/>
+            </w:tcBorders>
+            <w:tcMar>
+              <w:top w:type="dxa" w:w="55"/>
+              <w:left w:type="dxa" w:w="95"/>
+              <w:bottom w:type="dxa" w:w="55"/>
+              <w:right w:type="dxa" w:w="95"/>
+            </w:tcMar>
+            <w:vAlign w:val="top"/>
+          </w:tcPr>
+          <w:p>
+            <w:pPr>
+              <w:spacing w:after="0"/>
+            </w:pPr>
+            <w:r>
+              <w:rPr>
+                <w:rFonts w:ascii="Calibri" w:cs="Calibri" w:eastAsia="Microsoft YaHei" w:hAnsi="Calibri"/>
+                <w:sz w:val="19"/>
+                <w:szCs w:val="19"/>
+              </w:rPr>
+              <w:t xml:space="preserve">不作治疗决策阈值推断。项目预设</w:t>
+            </w:r>
+            <w:r>
+              <w:rPr>
+                <w:rFonts w:ascii="Calibri" w:cs="Calibri" w:eastAsia="Microsoft YaHei" w:hAnsi="Calibri"/>
+                <w:b/>
+                <w:bCs/>
+                <w:sz w:val="19"/>
+                <w:szCs w:val="19"/>
+              </w:rPr>
+              <w:t xml:space="preserve">每翻倍比值比 0.80–1.25 为"接近无关联"的解释区间</w:t>
+            </w:r>
+            <w:r>
+              <w:rPr>
+                <w:rFonts w:ascii="Calibri" w:cs="Calibri" w:eastAsia="Microsoft YaHei" w:hAnsi="Calibri"/>
+                <w:sz w:val="19"/>
+                <w:szCs w:val="19"/>
+              </w:rPr>
+              <w:t xml:space="preserve">（团队约定）。95% 置信区间落在一个解释区（明显负关联、接近无关联、明显正关联）内，且估计稳健：不因跨 1 自动降级；跨一个边界降 1 级；同时覆盖 &lt;0.80 和 &gt;1.25 降 2 级。再结合有效聚类数、稀疏事件、分离和区间可靠性解释，领域累计最多 2 级。另展示其他解释阈值的敏感性，不依真实结果调换预设阈值。</w:t>
+            </w:r>
+            <w:r>
+              <w:rPr>
+                <w:rFonts w:ascii="Calibri" w:cs="Calibri" w:eastAsia="Microsoft YaHei" w:hAnsi="Calibri"/>
+                <w:b/>
+                <w:bCs/>
+                <w:sz w:val="19"/>
+                <w:szCs w:val="19"/>
+              </w:rPr>
+              <w:t xml:space="preserve">至少 40 个事件对应样条的 4 个自由度只是样条可拟合条件，不是不精确降级标准</w:t>
+            </w:r>
+          </w:p>
+        </w:tc>
+        <w:tc>
+          <w:tcPr>
+            <w:tcW w:type="dxa" w:w="3068"/>
+            <w:tcBorders>
+              <w:top w:val="single" w:color="BBBBBB" w:sz="4"/>
+              <w:left w:val="single" w:color="BBBBBB" w:sz="4"/>
+              <w:bottom w:val="single" w:color="BBBBBB" w:sz="4"/>
+              <w:right w:val="single" w:color="BBBBBB" w:sz="4"/>
+            </w:tcBorders>
+            <w:tcMar>
+              <w:top w:type="dxa" w:w="55"/>
+              <w:left w:type="dxa" w:w="95"/>
+              <w:bottom w:type="dxa" w:w="55"/>
+              <w:right w:type="dxa" w:w="95"/>
+            </w:tcMar>
+            <w:vAlign w:val="top"/>
+          </w:tcPr>
+          <w:p>
+            <w:pPr>
+              <w:spacing w:after="0"/>
+            </w:pPr>
+            <w:r>
+              <w:rPr>
+                <w:rFonts w:ascii="Calibri" w:cs="Calibri" w:eastAsia="Microsoft YaHei" w:hAnsi="Calibri"/>
+                <w:sz w:val="19"/>
+                <w:szCs w:val="19"/>
+              </w:rPr>
+              <w:t xml:space="preserve">主分析比值比和 95% 置信区间、有效聚类数、事件数</w:t>
             </w:r>
           </w:p>
         </w:tc>
@@ -1144,7 +1270,7 @@
         </w:trPr>
         <w:tc>
           <w:tcPr>
-            <w:tcW w:type="dxa" w:w="1444"/>
+            <w:tcW w:type="dxa" w:w="1264"/>
             <w:tcBorders>
               <w:top w:val="single" w:color="BBBBBB" w:sz="4"/>
               <w:left w:val="single" w:color="BBBBBB" w:sz="4"/>
@@ -1175,63 +1301,80 @@
         </w:tc>
         <w:tc>
           <w:tcPr>
-            <w:tcW w:type="dxa" w:w="3971"/>
-            <w:tcBorders>
-              <w:top w:val="single" w:color="BBBBBB" w:sz="4"/>
-              <w:left w:val="single" w:color="BBBBBB" w:sz="4"/>
-              <w:bottom w:val="single" w:color="BBBBBB" w:sz="4"/>
-              <w:right w:val="single" w:color="BBBBBB" w:sz="4"/>
-            </w:tcBorders>
-            <w:tcMar>
-              <w:top w:type="dxa" w:w="55"/>
-              <w:left w:type="dxa" w:w="95"/>
-              <w:bottom w:type="dxa" w:w="55"/>
-              <w:right w:type="dxa" w:w="95"/>
-            </w:tcMar>
-            <w:vAlign w:val="top"/>
-          </w:tcPr>
-          <w:p>
-            <w:pPr>
-              <w:spacing w:after="0"/>
-            </w:pPr>
-            <w:r>
-              <w:rPr>
-                <w:rFonts w:ascii="Calibri" w:cs="Calibri" w:eastAsia="Microsoft YaHei" w:hAnsi="Calibri"/>
-                <w:sz w:val="19"/>
-                <w:szCs w:val="19"/>
-              </w:rPr>
-              <w:t xml:space="preserve">漏斗图不适用（协议）。按"单篇病例报告 vs 三例及以上连续系列"比较结局构成；保脾病例和有时间线的报告更容易发表；活力、持续时间缺失是否与结局有关 → 降 1 级到 2 级</w:t>
-            </w:r>
-          </w:p>
-        </w:tc>
-        <w:tc>
-          <w:tcPr>
-            <w:tcW w:type="dxa" w:w="3611"/>
-            <w:tcBorders>
-              <w:top w:val="single" w:color="BBBBBB" w:sz="4"/>
-              <w:left w:val="single" w:color="BBBBBB" w:sz="4"/>
-              <w:bottom w:val="single" w:color="BBBBBB" w:sz="4"/>
-              <w:right w:val="single" w:color="BBBBBB" w:sz="4"/>
-            </w:tcBorders>
-            <w:tcMar>
-              <w:top w:type="dxa" w:w="55"/>
-              <w:left w:type="dxa" w:w="95"/>
-              <w:bottom w:type="dxa" w:w="55"/>
-              <w:right w:type="dxa" w:w="95"/>
-            </w:tcMar>
-            <w:vAlign w:val="top"/>
-          </w:tcPr>
-          <w:p>
-            <w:pPr>
-              <w:spacing w:after="0"/>
-            </w:pPr>
-            <w:r>
-              <w:rPr>
-                <w:rFonts w:ascii="Calibri" w:cs="Calibri" w:eastAsia="Microsoft YaHei" w:hAnsi="Calibri"/>
-                <w:sz w:val="19"/>
-                <w:szCs w:val="19"/>
-              </w:rPr>
-              <w:t xml:space="preserve">报告类型比较；结局缺失和持续时间缺失的界限分析（附加分析 (b)、缺失持续时间界限）</w:t>
+            <w:tcW w:type="dxa" w:w="4694"/>
+            <w:tcBorders>
+              <w:top w:val="single" w:color="BBBBBB" w:sz="4"/>
+              <w:left w:val="single" w:color="BBBBBB" w:sz="4"/>
+              <w:bottom w:val="single" w:color="BBBBBB" w:sz="4"/>
+              <w:right w:val="single" w:color="BBBBBB" w:sz="4"/>
+            </w:tcBorders>
+            <w:tcMar>
+              <w:top w:type="dxa" w:w="55"/>
+              <w:left w:type="dxa" w:w="95"/>
+              <w:bottom w:type="dxa" w:w="55"/>
+              <w:right w:type="dxa" w:w="95"/>
+            </w:tcMar>
+            <w:vAlign w:val="top"/>
+          </w:tcPr>
+          <w:p>
+            <w:pPr>
+              <w:spacing w:after="0"/>
+            </w:pPr>
+            <w:r>
+              <w:rPr>
+                <w:rFonts w:ascii="Calibri" w:cs="Calibri" w:eastAsia="Microsoft YaHei" w:hAnsi="Calibri"/>
+                <w:sz w:val="19"/>
+                <w:szCs w:val="19"/>
+              </w:rPr>
+              <w:t xml:space="preserve">按协议对比单例报告与至少 3 例且 </w:t>
+            </w:r>
+            <w:r>
+              <w:rPr>
+                <w:rFonts w:ascii="Consolas" w:cs="Consolas" w:eastAsia="Microsoft YaHei" w:hAnsi="Consolas"/>
+                <w:sz w:val="19"/>
+                <w:szCs w:val="19"/>
+                <w:shd w:fill="EEEEEE" w:val="clear"/>
+              </w:rPr>
+              <w:t xml:space="preserve">consecutive = Yes</w:t>
+            </w:r>
+            <w:r>
+              <w:rPr>
+                <w:rFonts w:ascii="Calibri" w:cs="Calibri" w:eastAsia="Microsoft YaHei" w:hAnsi="Calibri"/>
+                <w:sz w:val="19"/>
+                <w:szCs w:val="19"/>
+              </w:rPr>
+              <w:t xml:space="preserve"> 的连续系列，记录持续时间、结局缺失。差异本身不能证明发表偏倚。有可信的选择性发表或选择性报告依据降 1 级，强且多方面依据降 2 级；不因"只有病例报告"这一标签自动再降。没有漏斗图不能解释为没有发表偏倚</w:t>
+            </w:r>
+          </w:p>
+        </w:tc>
+        <w:tc>
+          <w:tcPr>
+            <w:tcW w:type="dxa" w:w="3068"/>
+            <w:tcBorders>
+              <w:top w:val="single" w:color="BBBBBB" w:sz="4"/>
+              <w:left w:val="single" w:color="BBBBBB" w:sz="4"/>
+              <w:bottom w:val="single" w:color="BBBBBB" w:sz="4"/>
+              <w:right w:val="single" w:color="BBBBBB" w:sz="4"/>
+            </w:tcBorders>
+            <w:tcMar>
+              <w:top w:type="dxa" w:w="55"/>
+              <w:left w:type="dxa" w:w="95"/>
+              <w:bottom w:type="dxa" w:w="55"/>
+              <w:right w:type="dxa" w:w="95"/>
+            </w:tcMar>
+            <w:vAlign w:val="top"/>
+          </w:tcPr>
+          <w:p>
+            <w:pPr>
+              <w:spacing w:after="0"/>
+            </w:pPr>
+            <w:r>
+              <w:rPr>
+                <w:rFonts w:ascii="Calibri" w:cs="Calibri" w:eastAsia="Microsoft YaHei" w:hAnsi="Calibri"/>
+                <w:sz w:val="19"/>
+                <w:szCs w:val="19"/>
+              </w:rPr>
+              <w:t xml:space="preserve">报告类型比较；缺失时长（按类别界限）和缺失结局（界限）的分析</w:t>
             </w:r>
           </w:p>
         </w:tc>
@@ -1252,336 +1395,32 @@
         <w:rPr>
           <w:rFonts w:ascii="Calibri" w:cs="Calibri" w:eastAsia="Microsoft YaHei" w:hAnsi="Calibri"/>
         </w:rPr>
-        <w:t xml:space="preserve">4. 升级的三个领域</w:t>
-      </w:r>
-    </w:p>
-    <w:tbl>
-      <w:tblPr>
-        <w:tblW w:type="dxa" w:w="9026"/>
-        <w:tblBorders>
-          <w:top w:val="single" w:color="auto" w:sz="4"/>
-          <w:left w:val="single" w:color="auto" w:sz="4"/>
-          <w:bottom w:val="single" w:color="auto" w:sz="4"/>
-          <w:right w:val="single" w:color="auto" w:sz="4"/>
-          <w:insideH w:val="single" w:color="auto" w:sz="4"/>
-          <w:insideV w:val="single" w:color="auto" w:sz="4"/>
-        </w:tblBorders>
-      </w:tblPr>
-      <w:tblGrid>
-        <w:gridCol w:w="1805"/>
-        <w:gridCol w:w="7221"/>
-      </w:tblGrid>
-      <w:tr>
-        <w:trPr>
-          <w:cantSplit/>
-          <w:tblHeader/>
-        </w:trPr>
-        <w:tc>
-          <w:tcPr>
-            <w:tcW w:type="dxa" w:w="1805"/>
-            <w:tcBorders>
-              <w:top w:val="single" w:color="BBBBBB" w:sz="4"/>
-              <w:left w:val="single" w:color="BBBBBB" w:sz="4"/>
-              <w:bottom w:val="single" w:color="BBBBBB" w:sz="4"/>
-              <w:right w:val="single" w:color="BBBBBB" w:sz="4"/>
-            </w:tcBorders>
-            <w:shd w:fill="E8EEF4" w:val="clear"/>
-            <w:tcMar>
-              <w:top w:type="dxa" w:w="55"/>
-              <w:left w:type="dxa" w:w="95"/>
-              <w:bottom w:type="dxa" w:w="55"/>
-              <w:right w:type="dxa" w:w="95"/>
-            </w:tcMar>
-            <w:vAlign w:val="top"/>
-          </w:tcPr>
-          <w:p>
-            <w:pPr>
-              <w:spacing w:after="0"/>
-            </w:pPr>
-            <w:r>
-              <w:rPr>
-                <w:rFonts w:ascii="Calibri" w:cs="Calibri" w:eastAsia="Microsoft YaHei" w:hAnsi="Calibri"/>
-                <w:b/>
-                <w:bCs/>
-                <w:sz w:val="19"/>
-                <w:szCs w:val="19"/>
-              </w:rPr>
-              <w:t xml:space="preserve">领域</w:t>
-            </w:r>
-          </w:p>
-        </w:tc>
-        <w:tc>
-          <w:tcPr>
-            <w:tcW w:type="dxa" w:w="7221"/>
-            <w:tcBorders>
-              <w:top w:val="single" w:color="BBBBBB" w:sz="4"/>
-              <w:left w:val="single" w:color="BBBBBB" w:sz="4"/>
-              <w:bottom w:val="single" w:color="BBBBBB" w:sz="4"/>
-              <w:right w:val="single" w:color="BBBBBB" w:sz="4"/>
-            </w:tcBorders>
-            <w:shd w:fill="E8EEF4" w:val="clear"/>
-            <w:tcMar>
-              <w:top w:type="dxa" w:w="55"/>
-              <w:left w:type="dxa" w:w="95"/>
-              <w:bottom w:type="dxa" w:w="55"/>
-              <w:right w:type="dxa" w:w="95"/>
-            </w:tcMar>
-            <w:vAlign w:val="top"/>
-          </w:tcPr>
-          <w:p>
-            <w:pPr>
-              <w:spacing w:after="0"/>
-            </w:pPr>
-            <w:r>
-              <w:rPr>
-                <w:rFonts w:ascii="Calibri" w:cs="Calibri" w:eastAsia="Microsoft YaHei" w:hAnsi="Calibri"/>
-                <w:b/>
-                <w:bCs/>
-                <w:sz w:val="19"/>
-                <w:szCs w:val="19"/>
-              </w:rPr>
-              <w:t xml:space="preserve">规则</w:t>
-            </w:r>
-          </w:p>
-        </w:tc>
-      </w:tr>
-      <w:tr>
-        <w:trPr>
-          <w:cantSplit/>
-          <w:tblHeader w:val="false"/>
-        </w:trPr>
-        <w:tc>
-          <w:tcPr>
-            <w:tcW w:type="dxa" w:w="1805"/>
-            <w:tcBorders>
-              <w:top w:val="single" w:color="BBBBBB" w:sz="4"/>
-              <w:left w:val="single" w:color="BBBBBB" w:sz="4"/>
-              <w:bottom w:val="single" w:color="BBBBBB" w:sz="4"/>
-              <w:right w:val="single" w:color="BBBBBB" w:sz="4"/>
-            </w:tcBorders>
-            <w:tcMar>
-              <w:top w:type="dxa" w:w="55"/>
-              <w:left w:type="dxa" w:w="95"/>
-              <w:bottom w:type="dxa" w:w="55"/>
-              <w:right w:type="dxa" w:w="95"/>
-            </w:tcMar>
-            <w:vAlign w:val="top"/>
-          </w:tcPr>
-          <w:p>
-            <w:pPr>
-              <w:spacing w:after="0"/>
-            </w:pPr>
-            <w:r>
-              <w:rPr>
-                <w:rFonts w:ascii="Calibri" w:cs="Calibri" w:eastAsia="Microsoft YaHei" w:hAnsi="Calibri"/>
-                <w:sz w:val="19"/>
-                <w:szCs w:val="19"/>
-              </w:rPr>
-              <w:t xml:space="preserve">效应很大</w:t>
-            </w:r>
-          </w:p>
-        </w:tc>
-        <w:tc>
-          <w:tcPr>
-            <w:tcW w:type="dxa" w:w="7221"/>
-            <w:tcBorders>
-              <w:top w:val="single" w:color="BBBBBB" w:sz="4"/>
-              <w:left w:val="single" w:color="BBBBBB" w:sz="4"/>
-              <w:bottom w:val="single" w:color="BBBBBB" w:sz="4"/>
-              <w:right w:val="single" w:color="BBBBBB" w:sz="4"/>
-            </w:tcBorders>
-            <w:tcMar>
-              <w:top w:type="dxa" w:w="55"/>
-              <w:left w:type="dxa" w:w="95"/>
-              <w:bottom w:type="dxa" w:w="55"/>
-              <w:right w:type="dxa" w:w="95"/>
-            </w:tcMar>
-            <w:vAlign w:val="top"/>
-          </w:tcPr>
-          <w:p>
-            <w:pPr>
-              <w:spacing w:after="0"/>
-            </w:pPr>
-            <w:r>
-              <w:rPr>
-                <w:rFonts w:ascii="Calibri" w:cs="Calibri" w:eastAsia="Microsoft YaHei" w:hAnsi="Calibri"/>
-                <w:sz w:val="19"/>
-                <w:szCs w:val="19"/>
-              </w:rPr>
-              <w:t xml:space="preserve">先定：比值比 ≥ 2（或 ≤ 0.5）且区间不跨 1，</w:t>
-            </w:r>
-            <w:r>
-              <w:rPr>
-                <w:rFonts w:ascii="Calibri" w:cs="Calibri" w:eastAsia="Microsoft YaHei" w:hAnsi="Calibri"/>
-                <w:b/>
-                <w:bCs/>
-                <w:sz w:val="19"/>
-                <w:szCs w:val="19"/>
-              </w:rPr>
-              <w:t xml:space="preserve">且</w:t>
-            </w:r>
-            <w:r>
-              <w:rPr>
-                <w:rFonts w:ascii="Calibri" w:cs="Calibri" w:eastAsia="Microsoft YaHei" w:hAnsi="Calibri"/>
-                <w:sz w:val="19"/>
-                <w:szCs w:val="19"/>
-              </w:rPr>
-              <w:t xml:space="preserve">降级后仍有空间升级，才考虑升 1 级。病例报告来源的数据，选择性发表可能放大效应，升级须慎重</w:t>
-            </w:r>
-          </w:p>
-        </w:tc>
-      </w:tr>
-      <w:tr>
-        <w:trPr>
-          <w:cantSplit/>
-          <w:tblHeader w:val="false"/>
-        </w:trPr>
-        <w:tc>
-          <w:tcPr>
-            <w:tcW w:type="dxa" w:w="1805"/>
-            <w:tcBorders>
-              <w:top w:val="single" w:color="BBBBBB" w:sz="4"/>
-              <w:left w:val="single" w:color="BBBBBB" w:sz="4"/>
-              <w:bottom w:val="single" w:color="BBBBBB" w:sz="4"/>
-              <w:right w:val="single" w:color="BBBBBB" w:sz="4"/>
-            </w:tcBorders>
-            <w:tcMar>
-              <w:top w:type="dxa" w:w="55"/>
-              <w:left w:type="dxa" w:w="95"/>
-              <w:bottom w:type="dxa" w:w="55"/>
-              <w:right w:type="dxa" w:w="95"/>
-            </w:tcMar>
-            <w:vAlign w:val="top"/>
-          </w:tcPr>
-          <w:p>
-            <w:pPr>
-              <w:spacing w:after="0"/>
-            </w:pPr>
-            <w:r>
-              <w:rPr>
-                <w:rFonts w:ascii="Calibri" w:cs="Calibri" w:eastAsia="Microsoft YaHei" w:hAnsi="Calibri"/>
-                <w:sz w:val="19"/>
-                <w:szCs w:val="19"/>
-              </w:rPr>
-              <w:t xml:space="preserve">剂量-反应</w:t>
-            </w:r>
-          </w:p>
-        </w:tc>
-        <w:tc>
-          <w:tcPr>
-            <w:tcW w:type="dxa" w:w="7221"/>
-            <w:tcBorders>
-              <w:top w:val="single" w:color="BBBBBB" w:sz="4"/>
-              <w:left w:val="single" w:color="BBBBBB" w:sz="4"/>
-              <w:bottom w:val="single" w:color="BBBBBB" w:sz="4"/>
-              <w:right w:val="single" w:color="BBBBBB" w:sz="4"/>
-            </w:tcBorders>
-            <w:tcMar>
-              <w:top w:type="dxa" w:w="55"/>
-              <w:left w:type="dxa" w:w="95"/>
-              <w:bottom w:type="dxa" w:w="55"/>
-              <w:right w:type="dxa" w:w="95"/>
-            </w:tcMar>
-            <w:vAlign w:val="top"/>
-          </w:tcPr>
-          <w:p>
-            <w:pPr>
-              <w:spacing w:after="0"/>
-            </w:pPr>
-            <w:r>
-              <w:rPr>
-                <w:rFonts w:ascii="Calibri" w:cs="Calibri" w:eastAsia="Microsoft YaHei" w:hAnsi="Calibri"/>
-                <w:sz w:val="19"/>
-                <w:szCs w:val="19"/>
-              </w:rPr>
-              <w:t xml:space="preserve">四个持续时间类别的趋势检验（Cochran-Armitage）及连续模型方向一致，才考虑升 1 级</w:t>
-            </w:r>
-          </w:p>
-        </w:tc>
-      </w:tr>
-      <w:tr>
-        <w:trPr>
-          <w:cantSplit/>
-          <w:tblHeader w:val="false"/>
-        </w:trPr>
-        <w:tc>
-          <w:tcPr>
-            <w:tcW w:type="dxa" w:w="1805"/>
-            <w:tcBorders>
-              <w:top w:val="single" w:color="BBBBBB" w:sz="4"/>
-              <w:left w:val="single" w:color="BBBBBB" w:sz="4"/>
-              <w:bottom w:val="single" w:color="BBBBBB" w:sz="4"/>
-              <w:right w:val="single" w:color="BBBBBB" w:sz="4"/>
-            </w:tcBorders>
-            <w:tcMar>
-              <w:top w:type="dxa" w:w="55"/>
-              <w:left w:type="dxa" w:w="95"/>
-              <w:bottom w:type="dxa" w:w="55"/>
-              <w:right w:type="dxa" w:w="95"/>
-            </w:tcMar>
-            <w:vAlign w:val="top"/>
-          </w:tcPr>
-          <w:p>
-            <w:pPr>
-              <w:spacing w:after="0"/>
-            </w:pPr>
-            <w:r>
-              <w:rPr>
-                <w:rFonts w:ascii="Calibri" w:cs="Calibri" w:eastAsia="Microsoft YaHei" w:hAnsi="Calibri"/>
-                <w:sz w:val="19"/>
-                <w:szCs w:val="19"/>
-              </w:rPr>
-              <w:t xml:space="preserve">残余混杂只会削弱效应</w:t>
-            </w:r>
-          </w:p>
-        </w:tc>
-        <w:tc>
-          <w:tcPr>
-            <w:tcW w:type="dxa" w:w="7221"/>
-            <w:tcBorders>
-              <w:top w:val="single" w:color="BBBBBB" w:sz="4"/>
-              <w:left w:val="single" w:color="BBBBBB" w:sz="4"/>
-              <w:bottom w:val="single" w:color="BBBBBB" w:sz="4"/>
-              <w:right w:val="single" w:color="BBBBBB" w:sz="4"/>
-            </w:tcBorders>
-            <w:tcMar>
-              <w:top w:type="dxa" w:w="55"/>
-              <w:left w:type="dxa" w:w="95"/>
-              <w:bottom w:type="dxa" w:w="55"/>
-              <w:right w:type="dxa" w:w="95"/>
-            </w:tcMar>
-            <w:vAlign w:val="top"/>
-          </w:tcPr>
-          <w:p>
-            <w:pPr>
-              <w:spacing w:after="0"/>
-            </w:pPr>
-            <w:r>
-              <w:rPr>
-                <w:rFonts w:ascii="Calibri" w:cs="Calibri" w:eastAsia="Microsoft YaHei" w:hAnsi="Calibri"/>
-                <w:sz w:val="19"/>
-                <w:szCs w:val="19"/>
-              </w:rPr>
-              <w:t xml:space="preserve">本研究没有对混杂做充分校正（只校正年龄和发表时期）。除非能论证残余混杂方向只会削弱关联，否则不升级</w:t>
-            </w:r>
-          </w:p>
-        </w:tc>
-      </w:tr>
-    </w:tbl>
+        <w:t xml:space="preserve">4. 上调</w:t>
+      </w:r>
+    </w:p>
     <w:p>
       <w:pPr>
         <w:spacing w:after="120"/>
       </w:pPr>
-    </w:p>
-    <w:p>
-      <w:pPr>
-        <w:spacing w:after="120"/>
-      </w:pPr>
-      <w:r>
-        <w:rPr>
-          <w:rFonts w:ascii="Calibri" w:cs="Calibri" w:eastAsia="Microsoft YaHei" w:hAnsi="Calibri"/>
-        </w:rPr>
-        <w:t xml:space="preserve">升级只在没有因为严重偏倚风险或不精确降级的前提下才考虑。</w:t>
+      <w:r>
+        <w:rPr>
+          <w:rFonts w:ascii="Calibri" w:cs="Calibri" w:eastAsia="Microsoft YaHei" w:hAnsi="Calibri"/>
+        </w:rPr>
+        <w:t xml:space="preserve">本项目对主要关联</w:t>
+      </w:r>
+      <w:r>
+        <w:rPr>
+          <w:rFonts w:ascii="Calibri" w:cs="Calibri" w:eastAsia="Microsoft YaHei" w:hAnsi="Calibri"/>
+          <w:b/>
+          <w:bCs/>
+        </w:rPr>
+        <w:t xml:space="preserve">预设不上调</w:t>
+      </w:r>
+      <w:r>
+        <w:rPr>
+          <w:rFonts w:ascii="Calibri" w:cs="Calibri" w:eastAsia="Microsoft YaHei" w:hAnsi="Calibri"/>
+        </w:rPr>
+        <w:t xml:space="preserve">：不因效应大小、类别趋势检验或未经论证的混杂方向而上调。理由：比值比不是风险比，大小依赖持续时间的尺度；趋势检验与主要持续时间关联高度重叠，且未按报告聚类、未校正混杂。若日后确有足以改变规则的方法学依据，以有日期的方案修订记录披露，不追溯声称事前设定。高起点不允许超过高。</w:t>
       </w:r>
     </w:p>
     <w:p>
@@ -1787,7 +1626,7 @@
                 <w:sz w:val="19"/>
                 <w:szCs w:val="19"/>
               </w:rPr>
-              <w:t xml:space="preserve">降级、升级原因</w:t>
+              <w:t xml:space="preserve">降级原因及患者权重</w:t>
             </w:r>
           </w:p>
         </w:tc>
@@ -1985,7 +1824,7 @@
                 <w:sz w:val="19"/>
                 <w:szCs w:val="19"/>
               </w:rPr>
-              <w:t xml:space="preserve">等待手术期间扭转的比例</w:t>
+              <w:t xml:space="preserve">等待手术期间扭转的比例（描述）</w:t>
             </w:r>
           </w:p>
         </w:tc>
@@ -2078,7 +1917,7 @@
                 <w:sz w:val="19"/>
                 <w:szCs w:val="19"/>
               </w:rPr>
-              <w:t xml:space="preserve">[待填]</w:t>
+              <w:t xml:space="preserve">不套用</w:t>
             </w:r>
           </w:p>
         </w:tc>
@@ -2128,7 +1967,7 @@
         <w:rPr>
           <w:rFonts w:ascii="Calibri" w:cs="Calibri" w:eastAsia="Microsoft YaHei" w:hAnsi="Calibri"/>
         </w:rPr>
-        <w:t xml:space="preserve">可信度一栏只填：高 / 中 / 低 / 极低。不要在没有分析结果前填写。</w:t>
+        <w:t xml:space="preserve">可信度一栏只填：高 / 中 / 低 / 极低，没有分析结果前不填。</w:t>
       </w:r>
     </w:p>
     <w:p>
@@ -2157,7 +1996,7 @@
         <w:rPr>
           <w:rFonts w:ascii="Calibri" w:cs="Calibri" w:eastAsia="Microsoft YaHei" w:hAnsi="Calibri"/>
         </w:rPr>
-        <w:t xml:space="preserve">方法：一句话——"Certainty of the evidence for the primary association was rated with the GRADE approach for prognostic factors [引用]; the rules for downgrading and upgrading were fixed before the analysis (Additional file)."（引用待核实。）</w:t>
+        <w:t xml:space="preserve">方法（窄表述）："Analysis specifications and the operational rules for assessing certainty were finalized before the present statistical review accessed any real patient-level outcome data or fitted models to the real data. Code verification used synthetic data only."</w:t>
       </w:r>
     </w:p>
     <w:p>
@@ -2173,7 +2012,7 @@
         <w:rPr>
           <w:rFonts w:ascii="Calibri" w:cs="Calibri" w:eastAsia="Microsoft YaHei" w:hAnsi="Calibri"/>
         </w:rPr>
-        <w:t xml:space="preserve">结果：证据概要表 + 一段话，说明每个降级领域的依据。</w:t>
+        <w:t xml:space="preserve">方法：说明按预后因素的 GRADE 原则、起点为高、五个领域；未因观察到的比值比或趋势检验自动上调；协方差为按报告聚类的稳健协方差，小样本因子 G/(G−1)×(N−1)/(N−K)，置信区间为基于正态分布的 Wald 区间。</w:t>
       </w:r>
     </w:p>
     <w:p>
@@ -2189,7 +2028,7 @@
         <w:rPr>
           <w:rFonts w:ascii="Calibri" w:cs="Calibri" w:eastAsia="Microsoft YaHei" w:hAnsi="Calibri"/>
         </w:rPr>
-        <w:t xml:space="preserve">讨论和局限性：不论方向如何，都要写——数据来自病例报告和小系列，选择性报告和未校正的混杂使因果解释受限，可信度预期为很低到低。</w:t>
+        <w:t xml:space="preserve">更强的"before Ji Wang had access to any real outcome data"这一说法，只有王吉本人另行确认才可使用；协议已披露预试验和本院 5 例中 4 例失脾，因此不能说团队从未接触结局信息。</w:t>
       </w:r>
     </w:p>
     <w:p>
@@ -2205,20 +2044,7 @@
         <w:rPr>
           <w:rFonts w:ascii="Calibri" w:cs="Calibri" w:eastAsia="Microsoft YaHei" w:hAnsi="Calibri"/>
         </w:rPr>
-        <w:t xml:space="preserve">规则表作为附加文件，和检索策略、提取表一起提供。</w:t>
-      </w:r>
-    </w:p>
-    <w:p>
-      <w:pPr>
-        <w:pStyle w:val="Heading1"/>
-        <w:keepNext/>
-        <w:keepLines/>
-      </w:pPr>
-      <w:r>
-        <w:rPr>
-          <w:rFonts w:ascii="Calibri" w:cs="Calibri" w:eastAsia="Microsoft YaHei" w:hAnsi="Calibri"/>
-        </w:rPr>
-        <w:t xml:space="preserve">7. 没有核实的、需要决定的</w:t>
+        <w:t xml:space="preserve">结果：证据概要表 + 一段说明每个降级领域的依据。</w:t>
       </w:r>
     </w:p>
     <w:p>
@@ -2234,7 +2060,7 @@
         <w:rPr>
           <w:rFonts w:ascii="Calibri" w:cs="Calibri" w:eastAsia="Microsoft YaHei" w:hAnsi="Calibri"/>
         </w:rPr>
-        <w:t xml:space="preserve">GRADE 指南第 28 篇和 GRADE 手册原文没有读过；起点、降级和升级的具体门槛以原文为准。</w:t>
+        <w:t xml:space="preserve">讨论和局限性：不论方向都写——数据来自病例报告和小系列，选择性报告和未校正混杂限制因果解释；可信度预期为低至极低。</w:t>
       </w:r>
     </w:p>
     <w:p>
@@ -2250,7 +2076,20 @@
         <w:rPr>
           <w:rFonts w:ascii="Calibri" w:cs="Calibri" w:eastAsia="Microsoft YaHei" w:hAnsi="Calibri"/>
         </w:rPr>
-        <w:t xml:space="preserve">起点选高还是低；效应很大的阈值（比值比 2 / 0.5）是 Claude 的暂定值。</w:t>
+        <w:t xml:space="preserve">规则表作为附加文件，与检索策略、提取表一起提供。</w:t>
+      </w:r>
+    </w:p>
+    <w:p>
+      <w:pPr>
+        <w:pStyle w:val="Heading1"/>
+        <w:keepNext/>
+        <w:keepLines/>
+      </w:pPr>
+      <w:r>
+        <w:rPr>
+          <w:rFonts w:ascii="Calibri" w:cs="Calibri" w:eastAsia="Microsoft YaHei" w:hAnsi="Calibri"/>
+        </w:rPr>
+        <w:t xml:space="preserve">7. 没有核实的</w:t>
       </w:r>
     </w:p>
     <w:p>
@@ -2266,7 +2105,7 @@
         <w:rPr>
           <w:rFonts w:ascii="Calibri" w:cs="Calibri" w:eastAsia="Microsoft YaHei" w:hAnsi="Calibri"/>
         </w:rPr>
-        <w:t xml:space="preserve">是否对次要结论评级。</w:t>
+        <w:t xml:space="preserve">GRADE 指南第 28 篇和手册全文没有读过；规则的具体门槛为本项目约定。</w:t>
       </w:r>
     </w:p>
     <w:p>
@@ -2282,7 +2121,23 @@
         <w:rPr>
           <w:rFonts w:ascii="Calibri" w:cs="Calibri" w:eastAsia="Microsoft YaHei" w:hAnsi="Calibri"/>
         </w:rPr>
-        <w:t xml:space="preserve">这份框架在王吉看到分析结果之前定好，才有意义。</w:t>
+        <w:t xml:space="preserve">每翻倍 0.80–1.25 是团队约定，不是临床验证的最小重要差异。</w:t>
+      </w:r>
+    </w:p>
+    <w:p>
+      <w:pPr>
+        <w:pStyle w:val="ListParagraph"/>
+        <w:numPr>
+          <w:ilvl w:val="0"/>
+          <w:numId w:val="2"/>
+        </w:numPr>
+        <w:spacing w:after="60"/>
+      </w:pPr>
+      <w:r>
+        <w:rPr>
+          <w:rFonts w:ascii="Calibri" w:cs="Calibri" w:eastAsia="Microsoft YaHei" w:hAnsi="Calibri"/>
+        </w:rPr>
+        <w:t xml:space="preserve">单例报告占多数时，不一致和发表偏倚领域可能无法可靠评价，如实说明。</w:t>
       </w:r>
     </w:p>
     <w:p>
@@ -2293,7 +2148,7 @@
         <w:rPr>
           <w:rFonts w:ascii="Calibri" w:cs="Calibri" w:eastAsia="Microsoft YaHei" w:hAnsi="Calibri"/>
         </w:rPr>
-        <w:t xml:space="preserve">Sources: [GRADE guidelines 28 (Foroutan et al., J Clin Epidemiol 2020), publication record](https://researchconnect.buffalo.edu/en/publications/grade-guidelines-28-use-of-grade-for-the-assessment-of-evidence-a/); [GRADE Working Group blog summary of the paper](https://usblog.gradeworkinggroup.org/2020/06/research-shorts-use-of-grade-for.html)</w:t>
+        <w:t xml:space="preserve">Sources: [GRADE guidelines 28 (Foroutan et al., J Clin Epidemiol 2020;121:62-70), author abstract](https://pubmed.ncbi.nlm.nih.gov/31982539/)</w:t>
       </w:r>
     </w:p>
     <w:sectPr>
@@ -2361,7 +2216,7 @@
         <w:sz w:val="17"/>
         <w:szCs w:val="17"/>
       </w:rPr>
-      <w:t xml:space="preserve">GRADE 可信度框架 v2026-10-25a   |   第 </w:t>
+      <w:t xml:space="preserve">GRADE 可信度框架 v2026-10-25b   |   第 </w:t>
     </w:r>
     <w:r>
       <w:rPr>

</xml_diff>